<commit_message>
Final commit before submission
</commit_message>
<xml_diff>
--- a/Documentation/DV_Report_I012_I026_I034.docx
+++ b/Documentation/DV_Report_I012_I026_I034.docx
@@ -977,15 +977,7 @@
     </w:p>
     <w:p>
       <w:r>
-        <w:t>Using the prediction</w:t>
-      </w:r>
-      <w:proofErr w:type="gramStart"/>
-      <w:r>
-        <w:t>/error</w:t>
-      </w:r>
-      <w:proofErr w:type="gramEnd"/>
-      <w:r>
-        <w:t xml:space="preserve"> values in the supplied export, MAE is approximately 8.05 AQI points and RMSE is approximately 12.27 AQI points over 775 rows with predictions. MAE is the mean absolute difference between actual and predicted AQI. RMSE is the square root of the mean squared residual and penalises larger errors more strongly. These figures should be rechecked after any changes to the notebook, split, predictors or data types. They are not comparable to a future forecasting benchmark unless the evaluation protocol is redesigned accordingly.</w:t>
+        <w:t>Using the prediction/error values in the supplied export, MAE is approximately 8.05 AQI points and RMSE is approximately 12.27 AQI points over 775 rows with predictions. MAE is the mean absolute difference between actual and predicted AQI. RMSE is the square root of the mean squared residual and penalises larger errors more strongly. These figures should be rechecked after any changes to the notebook, split, predictors or data types. They are not comparable to a future forecasting benchmark unless the evaluation protocol is redesigned accordingly.</w:t>
       </w:r>
     </w:p>
     <w:p>
@@ -998,23 +990,7 @@
     </w:p>
     <w:p>
       <w:r>
-        <w:t xml:space="preserve">The single-page report is designed around a quick-read KPI row and </w:t>
-      </w:r>
-      <w:proofErr w:type="gramStart"/>
-      <w:r>
-        <w:t>supporting</w:t>
-      </w:r>
-      <w:proofErr w:type="gramEnd"/>
-      <w:r>
-        <w:t xml:space="preserve"> analytical visuals. Recommended elements include average AQI, maximum AQI, average PM2.5 and the count of station-day records with AQI above 200; an AQI trend line; a </w:t>
-      </w:r>
-      <w:proofErr w:type="gramStart"/>
-      <w:r>
-        <w:t>Top-N</w:t>
-      </w:r>
-      <w:proofErr w:type="gramEnd"/>
-      <w:r>
-        <w:t xml:space="preserve"> station ranking; a map using latitude/longitude; an AQI category distribution; an actual-versus-predicted scatter plot; and a PM2.5-versus-AQI scatter plot. Date, station and category slicers enable users to explore subsets. A date dimension should relate to the fact table using unique date keys rather than a repeated Year column.</w:t>
+        <w:t>The single-page report is designed around a quick-read KPI row and supporting analytical visuals. Recommended elements include average AQI, maximum AQI, average PM2.5 and the count of station-day records with AQI above 200; an AQI trend line; a Top-N station ranking; a map using latitude/longitude; an AQI category distribution; an actual-versus-predicted scatter plot; and a PM2.5-versus-AQI scatter plot. Date, station and category slicers enable users to explore subsets. A date dimension should relate to the fact table using unique date keys rather than a repeated Year column.</w:t>
       </w:r>
     </w:p>
     <w:p>
@@ -1106,15 +1082,7 @@
     </w:p>
     <w:p>
       <w:r>
-        <w:t xml:space="preserve">The stored model predictions yield MAE ≈ 8.05 and RMSE ≈ 12.27 AQI points on 775 predicted rows. The result demonstrates how a regression pipeline can be evaluated and surfaced in a dashboard. Because same-day pollutant values are used to estimate an AQI constructed from pollutant values, apparent accuracy can overstate practical forecasting usefulness. A future forecasting experiment should predict AQI </w:t>
-      </w:r>
-      <w:proofErr w:type="gramStart"/>
-      <w:r>
-        <w:t>at a later time</w:t>
-      </w:r>
-      <w:proofErr w:type="gramEnd"/>
-      <w:r>
-        <w:t xml:space="preserve"> using only information available before that forecast timestamp.</w:t>
+        <w:t>The stored model predictions yield MAE ≈ 8.05 and RMSE ≈ 12.27 AQI points on 775 predicted rows. The result demonstrates how a regression pipeline can be evaluated and surfaced in a dashboard. Because same-day pollutant values are used to estimate an AQI constructed from pollutant values, apparent accuracy can overstate practical forecasting usefulness. A future forecasting experiment should predict AQI at a later time using only information available before that forecast timestamp.</w:t>
       </w:r>
     </w:p>
     <w:p>
@@ -1482,15 +1450,7 @@
     </w:p>
     <w:p>
       <w:r>
-        <w:t xml:space="preserve">This project demonstrates an end-to-end environmental analytics workflow that turns historical station-day air-quality data into a cleaned analytical dataset, </w:t>
-      </w:r>
-      <w:proofErr w:type="gramStart"/>
-      <w:r>
-        <w:t>exploratory</w:t>
-      </w:r>
-      <w:proofErr w:type="gramEnd"/>
-      <w:r>
-        <w:t xml:space="preserve"> visuals, a Random Forest regression baseline and an interactive Power BI report. The exported data show a mean AQI of about 103.1, with observations distributed across Good, Satisfactory, Moderate, Poor and Very Poor categories. The model evaluation provides a concrete example of measuring regression error and displaying predicted versus observed values. The principal value of the work is the integration of data preparation, analysis, modelling and communication in one reproducible workflow, together with explicit disclosure of coverage and model limitations.</w:t>
+        <w:t>This project demonstrates an end-to-end environmental analytics workflow that turns historical station-day air-quality data into a cleaned analytical dataset, exploratory visuals, a Random Forest regression baseline and an interactive Power BI report. The exported data show a mean AQI of about 103.1, with observations distributed across Good, Satisfactory, Moderate, Poor and Very Poor categories. The model evaluation provides a concrete example of measuring regression error and displaying predicted versus observed values. The principal value of the work is the integration of data preparation, analysis, modelling and communication in one reproducible workflow, together with explicit disclosure of coverage and model limitations.</w:t>
       </w:r>
     </w:p>
     <w:p>
@@ -1552,15 +1512,7 @@
         <w:spacing w:after="60"/>
       </w:pPr>
       <w:r>
-        <w:t xml:space="preserve">Improve explainability with permutation importance or </w:t>
-      </w:r>
-      <w:proofErr w:type="gramStart"/>
-      <w:r>
-        <w:t>SHAP, and</w:t>
-      </w:r>
-      <w:proofErr w:type="gramEnd"/>
-      <w:r>
-        <w:t xml:space="preserve"> distinguish predictive association from causal attribution.</w:t>
+        <w:t>Improve explainability with permutation importance or SHAP, and distinguish predictive association from causal attribution.</w:t>
       </w:r>
     </w:p>
     <w:p>
@@ -1594,7 +1546,7 @@
             <w:color w:val="0563C1"/>
             <w:u w:val="single"/>
           </w:rPr>
-          <w:t>Source</w:t>
+          <w:t>https://www.airquality.cpcb.gov.in/ccr_docs/About_AQI.pdf</w:t>
         </w:r>
       </w:hyperlink>
     </w:p>
@@ -1611,7 +1563,7 @@
             <w:color w:val="0563C1"/>
             <w:u w:val="single"/>
           </w:rPr>
-          <w:t>Source</w:t>
+          <w:t>https://www.who.int/publications/i/item/9789240034228/</w:t>
         </w:r>
       </w:hyperlink>
     </w:p>
@@ -1628,7 +1580,7 @@
             <w:color w:val="0563C1"/>
             <w:u w:val="single"/>
           </w:rPr>
-          <w:t>Source</w:t>
+          <w:t>https://link.springer.com/article/10.1007/s10462-023-10424-4</w:t>
         </w:r>
       </w:hyperlink>
     </w:p>
@@ -1645,7 +1597,7 @@
             <w:color w:val="0563C1"/>
             <w:u w:val="single"/>
           </w:rPr>
-          <w:t>Source</w:t>
+          <w:t>https://www.sciencedirect.com/science/article/pii/S0048969725022338</w:t>
         </w:r>
       </w:hyperlink>
     </w:p>
@@ -1662,7 +1614,7 @@
             <w:color w:val="0563C1"/>
             <w:u w:val="single"/>
           </w:rPr>
-          <w:t>Source</w:t>
+          <w:t>https://www.kaggle.com/datasets/rohanrao/air-quality-data-in-india</w:t>
         </w:r>
       </w:hyperlink>
     </w:p>
@@ -1679,7 +1631,7 @@
             <w:color w:val="0563C1"/>
             <w:u w:val="single"/>
           </w:rPr>
-          <w:t>Source</w:t>
+          <w:t>https://scikit-learn.org/stable/modules/generated/sklearn.ensemble.RandomForestRegressor.html</w:t>
         </w:r>
       </w:hyperlink>
     </w:p>
@@ -1696,7 +1648,7 @@
             <w:color w:val="0563C1"/>
             <w:u w:val="single"/>
           </w:rPr>
-          <w:t>Source</w:t>
+          <w:t>https://learn.microsoft.com/power-bi/</w:t>
         </w:r>
       </w:hyperlink>
     </w:p>

</xml_diff>